<commit_message>
fix: clean scripts, live images, and ignore local secrets
Co-authored-by: Cursor <cursoragent@cursor.com>
</commit_message>
<xml_diff>
--- a/use-cases/kathans22/pitch-deck-narrative/evidence/narratives/pitch-script-edtech-claritydocs.docx
+++ b/use-cases/kathans22/pitch-deck-narrative/evidence/narratives/pitch-script-edtech-claritydocs.docx
@@ -35,15 +35,6 @@
       </w:r>
     </w:p>
     <w:p>
-      <w:pPr>
-        <w:pStyle w:val="Heading3"/>
-      </w:pPr>
-      <w:r>
-        <w:rPr/>
-        <w:t>Slide-equivalent 1 — Opening / Hook</w:t>
-      </w:r>
-    </w:p>
-    <w:p>
       <w:r>
         <w:rPr>
           <w:b/>
@@ -52,7 +43,7 @@
       </w:r>
       <w:r>
         <w:rPr/>
-        <w:t xml:space="preserve"> ClarityDocs helps academic operations teams transform messy, contradictory policy handbooks into a single source of truth, without asking your staff to abandon the documents they already use.</w:t>
+        <w:t xml:space="preserve"> ClarityDocs helps academic operations teams turn contradictory policy handbooks into a provenance-backed register — without asking staff to abandon the documents they already use.</w:t>
       </w:r>
     </w:p>
     <w:p>
@@ -64,37 +55,13 @@
       </w:r>
       <w:r>
         <w:rPr/>
-        <w:t xml:space="preserve"> Academic operations leaders today are drowning in document sprawl. You have course catalogues, handbooks, and policy guides spread across multiple campuses, and worst of all, they rarely agree. When a policy changes in one PDF, it often stays stuck in another, creating a compliance nightmare that puts your accreditation and state authorizations at risk.</w:t>
+        <w:t xml:space="preserve"> Academic operations leaders drown in document sprawl. Course catalogues, handbooks, and policy guides spread across campuses, and they rarely agree. When a policy changes in one PDF, it often stays stuck in another, creating an accreditation and state-authorization nightmare.</w:t>
       </w:r>
     </w:p>
     <w:p>
       <w:r>
         <w:rPr/>
-        <w:t>But the traditional solution has always been 'more': more software, a new archive, or a slide-based demo screen that doesn't actually help your daily work. We built ClarityDocs to do the opposite. We ground every operational claim in the actual source text, stage human reviews for every single change, and let you export finished work as the ordinary documents your team already relies on. We aren't here to polish a demo screen; we’re here to give you proof.</w:t>
-      </w:r>
-    </w:p>
-    <w:p>
-      <w:r>
-        <w:rPr>
-          <w:i/>
-        </w:rPr>
-        <w:t>Talking point:</w:t>
-      </w:r>
-      <w:r>
-        <w:rPr/>
-        <w:t xml:space="preserve"> PLACEHOLDER_TALKING_POINT_1</w:t>
-      </w:r>
-    </w:p>
-    <w:p>
-      <w:r>
-        <w:rPr>
-          <w:i/>
-        </w:rPr>
-        <w:t>Speaker notes:</w:t>
-      </w:r>
-      <w:r>
-        <w:rPr/>
-        <w:t xml:space="preserve"> PLACEHOLDER_SPEAKER_NOTES_1</w:t>
+        <w:t>The usual offer is more software, a new archive, or a slide-based demo that does not help daily work. ClarityDocs does the opposite: ground every operational claim in source text, stage a human review for every change, export ordinary documents. Proof, not a demo screen.</w:t>
       </w:r>
     </w:p>
     <w:p>
@@ -115,7 +82,7 @@
       </w:r>
       <w:r>
         <w:rPr/>
-        <w:t xml:space="preserve"> Our current policy environment isn't just inefficient — it’s a source of genuine risk, because the documents students rely on often contradict the policies our campuses are actually enforcing.</w:t>
+        <w:t xml:space="preserve"> The policy environment is not just inefficient — students rely on documents that often contradict the policies campuses actually enforce.</w:t>
       </w:r>
     </w:p>
     <w:p>
@@ -127,43 +94,13 @@
       </w:r>
       <w:r>
         <w:rPr/>
-        <w:t xml:space="preserve"> Registrars and operations leads today are managing a sprawling ecosystem of course catalogues, handbooks, and grievance procedures. The core issue isn't just volume; it's the lack of synchronization. A vital policy update approved by the academic senate is often made to a master PDF, but that change fails to propagate to the HTML handbook, the student portal, or individual campus websites.</w:t>
+        <w:t xml:space="preserve"> Registrars manage catalogues, handbooks, and grievance procedures that fail to stay in sync. A senate-approved update lands in a master PDF and never reaches the HTML handbook or a campus site.</w:t>
       </w:r>
     </w:p>
     <w:p>
       <w:r>
         <w:rPr/>
-        <w:t>This divergence creates real institutional friction. We’ve seen academic appeals committees lose hours arguing over which document—and which version of that document—should have been authoritative when a grade appeal was submitted. Without a verifiable register, you’re forced to argue from ambiguity rather than clear, grounded policy.</w:t>
-      </w:r>
-    </w:p>
-    <w:p>
-      <w:r>
-        <w:rPr/>
-        <w:t>We know why this hasn't been automated away yet. You cannot simply feed sensitive education records or student narratives into an AI workspace for convenience. Any solution we use has to respect FERPA, ensure data minimization, and offer absolute provenance—showing exactly where a claim came from. You need a system that keeps the human in the loop, validating every change, so we’re proving institutional policy rather than delegating it.</w:t>
-      </w:r>
-    </w:p>
-    <w:p>
-      <w:r>
-        <w:rPr>
-          <w:i/>
-        </w:rPr>
-        <w:t>Talking point:</w:t>
-      </w:r>
-      <w:r>
-        <w:rPr/>
-        <w:t xml:space="preserve"> PLACEHOLDER_TALKING_POINT_2</w:t>
-      </w:r>
-    </w:p>
-    <w:p>
-      <w:r>
-        <w:rPr>
-          <w:i/>
-        </w:rPr>
-        <w:t>Speaker notes:</w:t>
-      </w:r>
-      <w:r>
-        <w:rPr/>
-        <w:t xml:space="preserve"> PLACEHOLDER_SPEAKER_NOTES_2</w:t>
+        <w:t>Appeals committees then argue over which version was authoritative when a grade appeal was filed. You cannot feed education records or identifiable student narratives into an AI workspace for convenience. FERPA (and COPPA where under-13 products apply) is the buyer's orientation — not a claim that ClarityDocs is certified. Any rewrite of handbook language must show provenance and keep humans approving each change, with no automated decisions about student rights.</w:t>
       </w:r>
     </w:p>
     <w:p>
@@ -177,20 +114,26 @@
     </w:p>
     <w:p>
       <w:r>
+        <w:rPr>
+          <w:b/>
+        </w:rPr>
+        <w:t>Talking point:</w:t>
+      </w:r>
+      <w:r>
         <w:rPr/>
-        <w:t>Our focus in the academic operations vertical centers on streamlining the student lifecycle, from onboarding through graduation. By automating registration workflows and leveraging data analytics, we ensure that faculty support systems are always synchronized with real-time student engagement metrics, ultimately driving better retention and learning outcomes.</w:t>
+        <w:t xml:space="preserve"> Accreditation packs and term-effective dates have made "whichever PDF was last emailed" an indefensible source of truth.</w:t>
       </w:r>
     </w:p>
     <w:p>
       <w:r>
         <w:rPr>
-          <w:i/>
+          <w:b/>
         </w:rPr>
         <w:t>Speaker notes:</w:t>
       </w:r>
       <w:r>
         <w:rPr/>
-        <w:t xml:space="preserve"> This section focuses on Edtech academic operations, ensuring seamless integration between course delivery platforms and student support systems. We must monitor key performance indicators for student engagement and faculty responsiveness, while maintaining data integrity across all learning management modules.</w:t>
+        <w:t xml:space="preserve"> Four campuses publishing conflicting grade-appeal timelines is not a future risk; it is the current state. Committees cannot reconstruct which handbook governed a term. The pressure is accreditation language consistency plus FERPA constraints on who may see education records. Manual reconciliation does not scale across terms. ClarityDocs is for the registrar who must show a register, not a folder of competing PDFs.</w:t>
       </w:r>
     </w:p>
     <w:p>
@@ -204,14 +147,26 @@
     </w:p>
     <w:p>
       <w:r>
+        <w:rPr>
+          <w:b/>
+        </w:rPr>
+        <w:t>Talking point:</w:t>
+      </w:r>
+      <w:r>
         <w:rPr/>
-        <w:t>We are currently focused on optimizing our academic operations by centralizing course provisioning workflows, which will directly reduce faculty onboarding time by 30% this quarter.</w:t>
+        <w:t xml:space="preserve"> ClarityDocs ingests the catalogues and handbooks you already have, stages every finding for a named human, and exports a speaking brief as ordinary DOCX — never a slide file.</w:t>
       </w:r>
     </w:p>
     <w:p>
       <w:r>
+        <w:rPr>
+          <w:b/>
+        </w:rPr>
+        <w:t>Speaker notes:</w:t>
+      </w:r>
+      <w:r>
         <w:rPr/>
-        <w:t>For the EdTech academic operations vertical, our focus remains on optimizing student lifecycle management and streamlining faculty workflows. By integrating automated enrollment processes with real-time analytics, we ensure that both administrative burdens and instructional friction are significantly reduced, allowing institutions to scale effectively while maintaining high-quality learning outcomes.</w:t>
+        <w:t xml:space="preserve"> The product is held constant: extract facts with citations, run staged checks against the policy pack you name, export DOCX/PDF. In academic ops that means synthetic handbook excerpts and catalogue text — not live student records in the demo corpus. Rejected items stay rejected. The academic senate still decides; the tool does not.</w:t>
       </w:r>
     </w:p>
     <w:p>
@@ -226,25 +181,25 @@
     <w:p>
       <w:r>
         <w:rPr>
-          <w:i/>
+          <w:b/>
         </w:rPr>
         <w:t>Talking point:</w:t>
       </w:r>
       <w:r>
         <w:rPr/>
-        <w:t xml:space="preserve"> Now, let's turn our attention to the specific operational metrics that drive our quarterly goals.</w:t>
+        <w:t xml:space="preserve"> ClarityDocs builds a conflict register across campus handbooks: every flagged contradiction cites a source page, and nothing about student rights ships without a human gate.</w:t>
       </w:r>
     </w:p>
     <w:p>
       <w:r>
         <w:rPr>
-          <w:i/>
+          <w:b/>
         </w:rPr>
         <w:t>Speaker notes:</w:t>
       </w:r>
       <w:r>
         <w:rPr/>
-        <w:t xml:space="preserve"> Our next segment focuses on the practical implementation of these strategies. We will walk through three key phases: assessment, integration, and finally, optimization. Each step is critical for long-term success.</w:t>
+        <w:t xml:space="preserve"> Course catalogues, student handbooks, and grievance procedures diverge by campus and term. ClarityDocs ingests those sources, maps conflicts, and stages each finding. Committee chairs approve or reject. A proposed "harmonised" timeline that would shorten a statutory notice window can be rejected while the rest commits. Export is a DOCX speaking brief for the next academic senate — not a slide deck, not an automated disciplinary decision.</w:t>
       </w:r>
     </w:p>
     <w:p>
@@ -258,31 +213,67 @@
     </w:p>
     <w:p>
       <w:r>
+        <w:drawing>
+          <wp:inline xmlns:a="http://schemas.openxmlformats.org/drawingml/2006/main" xmlns:pic="http://schemas.openxmlformats.org/drawingml/2006/picture">
+            <wp:extent cx="4572000" cy="2493818"/>
+            <wp:docPr id="1" name="Picture 1"/>
+            <wp:cNvGraphicFramePr>
+              <a:graphicFrameLocks noChangeAspect="1"/>
+            </wp:cNvGraphicFramePr>
+            <a:graphic>
+              <a:graphicData uri="http://schemas.openxmlformats.org/drawingml/2006/picture">
+                <pic:pic>
+                  <pic:nvPicPr>
+                    <pic:cNvPr id="0" name="image.jpg"/>
+                    <pic:cNvPicPr/>
+                  </pic:nvPicPr>
+                  <pic:blipFill>
+                    <a:blip r:embed="rId9"/>
+                    <a:stretch>
+                      <a:fillRect/>
+                    </a:stretch>
+                  </pic:blipFill>
+                  <pic:spPr>
+                    <a:xfrm>
+                      <a:off x="0" y="0"/>
+                      <a:ext cx="4572000" cy="2493818"/>
+                    </a:xfrm>
+                    <a:prstGeom prst="rect"/>
+                  </pic:spPr>
+                </pic:pic>
+              </a:graphicData>
+            </a:graphic>
+          </wp:inline>
+        </w:drawing>
+      </w:r>
+    </w:p>
+    <w:p>
+      <w:r>
         <w:rPr>
-          <w:i/>
+          <w:b/>
         </w:rPr>
         <w:t>Talking point:</w:t>
       </w:r>
       <w:r>
         <w:rPr/>
-        <w:t xml:space="preserve"> [Insert speaker script here]</w:t>
+        <w:t xml:space="preserve"> Invented Lumen State Academic Ops: 4 campuses published conflicting grade-appeal timelines; ClarityDocs staged a conflict register on synthetic handbook excerpts; chairs rejected 1 proposed timeline that would have shortened a statutory notice window; 3 remaining items committed with citations and exported as a DOCX senate brief.</w:t>
       </w:r>
     </w:p>
     <w:p>
       <w:r>
         <w:rPr>
-          <w:i/>
+          <w:b/>
         </w:rPr>
         <w:t>Speaker notes:</w:t>
       </w:r>
       <w:r>
         <w:rPr/>
-        <w:t xml:space="preserve"> This section covers the strategic roadmap for the upcoming quarter. We will prioritize resource allocation toward our high-impact growth initiatives and address the key technical debt items identified in the last sprint retrospective.</w:t>
+        <w:t xml:space="preserve"> No real student records were in the corpus. Four campus PDFs, one conflict register, one rejected harmonisation, remaining items committed with citations. A presenter can point at those counts: four sources, one rejection, the rest kept. That is the proof pattern — comparative figures plus human authority intact.</w:t>
       </w:r>
     </w:p>
     <w:p>
       <w:pPr>
-        <w:pStyle w:val="Heading3"/>
+        <w:pStyle w:val="Heading2"/>
       </w:pPr>
       <w:r>
         <w:rPr/>
@@ -298,7 +289,7 @@
       </w:r>
       <w:r>
         <w:rPr/>
-        <w:t xml:space="preserve"> "We built ClarityDocs for proof, not polish, which means your sensitive student narratives stay strictly outside the machine and your human experts stay firmly in the loop."</w:t>
+        <w:t xml:space="preserve"> We will not put student education records or identifiable student narratives into an AI workspace for convenience — and ClarityDocs is built so you do not have to.</w:t>
       </w:r>
     </w:p>
     <w:p>
@@ -310,36 +301,7 @@
       </w:r>
       <w:r>
         <w:rPr/>
-        <w:t xml:space="preserve"> ClarityDocs is designed specifically for academic operations that manage sensitive student narratives and policy language. We respect that you need to be cautious about putting FERPA-protected education records into a cloud workspace. The objection usually comes from a place of not wanting automated systems to make black-box decisions about student rights or disciplinary outcomes. ClarityDocs addresses this by keeping the human in the loop—you stage every review, you approve every item, and the tool never rewrites a policy without a clear audit trail. We don’t use automated decisioning tools that affect student rights. Instead, we use a conflict register approach that shows you exactly where campus policy divergence exists—like the Lumen State reference story, where committee chairs caught a non-compliant timeline proposal. You keep the human authority, and we simply surface the work that needs to be approved.</w:t>
-      </w:r>
-    </w:p>
-    <w:p>
-      <w:pPr>
-        <w:pStyle w:val="Heading2"/>
-      </w:pPr>
-      <w:r>
-        <w:rPr/>
-        <w:t>Navigating Institutional Resistance: Strategic Objection Handling in EdTech Implementation</w:t>
-      </w:r>
-    </w:p>
-    <w:p>
-      <w:r>
-        <w:rPr>
-          <w:i/>
-        </w:rPr>
-        <w:t>Talking point:</w:t>
-      </w:r>
-      <w:r>
-        <w:rPr/>
-        <w:t xml:space="preserve"> Ensure faculty and staff are aligned on the upcoming academic calendar and critical assessment deadlines.</w:t>
-      </w:r>
-    </w:p>
-    <w:p>
-      <w:r>
-        <w:rPr>
-          <w:i/>
-        </w:rPr>
-        <w:t>Speaker notes: Operationalize the rollout of the new LMS integration across all departmental faculties, ensuring faculty-wide compliance with the updated digital pedagogy standards.</w:t>
+        <w:t xml:space="preserve"> The objection is correct. FERPA limits who may see education records. ClarityDocs is a decision-support register for policy language, not an autonomous system that decides student rights or disciplinary outcomes. Demo work uses synthetic handbook excerpts. Every proposed edit carries a citation. Humans approve each change. We do not claim FERPA or COPPA certification.</w:t>
       </w:r>
     </w:p>
     <w:p>
@@ -354,21 +316,61 @@
     <w:p>
       <w:r>
         <w:rPr>
-          <w:i/>
+          <w:b/>
         </w:rPr>
         <w:t>Talking point:</w:t>
       </w:r>
       <w:r>
         <w:rPr/>
-        <w:t xml:space="preserve"> Think about the time a registrar office spends today manually reconciling a course catalogue against the current student handbook for four different campuses. It’s endless email chains, versioning PDFs, and eventually just accepting that current means whatever the last PDF version says. That administrative time is your primary ROI. By using ClarityDocs, you replace the manual register-check with a streamlined workflow that flags those inconsistencies before they ever hit a student hands. The second ROI is risk mitigation. Accreditation packs require consistent, verifiable policy language. When you present to an academic senate or an accreditation board, ClarityDocs produces a structured export of your validated policy base, demonstrating you have a process for maintaining truth. This reduces the time to prepare for audit significantly, while eliminating the potential for costly policy contradictions.</w:t>
+        <w:t xml:space="preserve"> A registrar team reconciling a course catalogue against the student handbook across four campuses today spends weeks in email and PDF versions; ClarityDocs flags those inconsistencies before they reach students and cuts audit-prep from that scramble to a cited export.</w:t>
+      </w:r>
+    </w:p>
+    <w:p>
+      <w:r>
+        <w:drawing>
+          <wp:inline xmlns:a="http://schemas.openxmlformats.org/drawingml/2006/main" xmlns:pic="http://schemas.openxmlformats.org/drawingml/2006/picture">
+            <wp:extent cx="4572000" cy="3265714"/>
+            <wp:docPr id="2" name="Picture 2"/>
+            <wp:cNvGraphicFramePr>
+              <a:graphicFrameLocks noChangeAspect="1"/>
+            </wp:cNvGraphicFramePr>
+            <a:graphic>
+              <a:graphicData uri="http://schemas.openxmlformats.org/drawingml/2006/picture">
+                <pic:pic>
+                  <pic:nvPicPr>
+                    <pic:cNvPr id="0" name="image.png"/>
+                    <pic:cNvPicPr/>
+                  </pic:nvPicPr>
+                  <pic:blipFill>
+                    <a:blip r:embed="rId10"/>
+                    <a:stretch>
+                      <a:fillRect/>
+                    </a:stretch>
+                  </pic:blipFill>
+                  <pic:spPr>
+                    <a:xfrm>
+                      <a:off x="0" y="0"/>
+                      <a:ext cx="4572000" cy="3265714"/>
+                    </a:xfrm>
+                    <a:prstGeom prst="rect"/>
+                  </pic:spPr>
+                </pic:pic>
+              </a:graphicData>
+            </a:graphic>
+          </wp:inline>
+        </w:drawing>
       </w:r>
     </w:p>
     <w:p>
       <w:r>
         <w:rPr>
-          <w:i/>
+          <w:b/>
         </w:rPr>
-        <w:t>Strategic Implementation Notes:</w:t>
+        <w:t>Speaker notes:</w:t>
+      </w:r>
+      <w:r>
+        <w:rPr/>
+        <w:t xml:space="preserve"> Primary ROI is staff time: four campuses, competing PDFs, no register. Secondary ROI is risk: accreditation packs need consistent published language. When you present to an academic senate, you export a structured, sourced policy base rather than arguing from the last attachment. Time comparison: weeks of manual reconciliation versus a staged register you can export the same day you close reviews.</w:t>
       </w:r>
     </w:p>
     <w:p>
@@ -385,120 +387,11 @@
         <w:rPr>
           <w:b/>
         </w:rPr>
-        <w:t>Slide-equivalent 9 — Call to Action</w:t>
-      </w:r>
-      <w:r>
-        <w:br/>
-      </w:r>
-      <w:r>
-        <w:br/>
-      </w:r>
-      <w:r>
-        <w:rPr>
-          <w:i/>
-        </w:rPr>
         <w:t>Talking point:</w:t>
       </w:r>
       <w:r>
         <w:rPr/>
-        <w:t xml:space="preserve"> Let’s stop arguing about which version of the handbook is current and give your registrar team the confidence of a single, provenance-backed truth.</w:t>
-      </w:r>
-      <w:r>
-        <w:br/>
-      </w:r>
-      <w:r>
-        <w:br/>
-      </w:r>
-      <w:r>
-        <w:rPr>
-          <w:i/>
-        </w:rPr>
-        <w:t>Speaker notes:</w:t>
-      </w:r>
-      <w:r>
-        <w:rPr/>
-        <w:t xml:space="preserve"> The fear of conflicting handbook language across your campuses isn't just an ops annoyance—it’s an accreditation and FERPA risk. When you have four different versions of an 'authoritative' policy floating around as PDFs, you aren't just losing time tracking edits; you're losing the ability to defend your decisions to academic senates or accrediting bodies.</w:t>
-      </w:r>
-      <w:r>
-        <w:br/>
-      </w:r>
-      <w:r>
-        <w:br/>
-      </w:r>
-      <w:r>
-        <w:rPr/>
-        <w:t>ClarityDocs changes that narrative by putting the proof of your policy's history right alongside the text. You get a living register of every change, grounded in source documents, so when a grievance committee asks why a grade appeal timeline was enforced on a specific term effective date, your team points to the record, not a folder of confusing PDFs. We aren't asking you to move to a new archive or a slide tool; we're asking you to make the documents you already live in—your handbooks, your catalogues—the source of truth they should be.</w:t>
-      </w:r>
-    </w:p>
-    <w:p>
-      <w:r>
-        <w:rPr>
-          <w:b/>
-        </w:rPr>
-        <w:t>Slide-equivalent 9 — Call to Action</w:t>
-      </w:r>
-      <w:r>
-        <w:br/>
-      </w:r>
-      <w:r>
-        <w:br/>
-      </w:r>
-      <w:r>
-        <w:rPr>
-          <w:i/>
-        </w:rPr>
-        <w:t>Talking point:</w:t>
-      </w:r>
-      <w:r>
-        <w:rPr/>
-        <w:t xml:space="preserve"> Let’s stop arguing about which version of the handbook is current and give your registrar team the confidence of a single, provenance-backed truth.</w:t>
-      </w:r>
-      <w:r>
-        <w:br/>
-      </w:r>
-      <w:r>
-        <w:br/>
-      </w:r>
-      <w:r>
-        <w:rPr>
-          <w:i/>
-        </w:rPr>
-        <w:t>Speaker notes:</w:t>
-      </w:r>
-      <w:r>
-        <w:rPr/>
-        <w:t xml:space="preserve"> The fear of conflicting handbook language across your campuses isn't just an ops annoyance—it’s an accreditation and FERPA risk. When you have four different versions of an 'authoritative' policy floating around as PDFs, you aren't just losing time tracking edits; you're losing the ability to defend your decisions to academic senates or accrediting bodies.</w:t>
-      </w:r>
-      <w:r>
-        <w:br/>
-      </w:r>
-      <w:r>
-        <w:br/>
-      </w:r>
-      <w:r>
-        <w:rPr/>
-        <w:t>ClarityDocs changes that narrative by putting the proof of your policy's history right alongside the text. You get a living register of every change, grounded in source documents, so when a grievance committee asks why a grade appeal timeline was enforced on a specific term effective date, your team points to the record, not a folder of confusing PDFs. We aren't asking you to move to a new archive or a slide tool; we're asking you to make the documents you already live in—your handbooks, your catalogues—the source of truth they should be.</w:t>
-      </w:r>
-    </w:p>
-    <w:p>
-      <w:pPr>
-        <w:pStyle w:val="Heading3"/>
-      </w:pPr>
-      <w:r>
-        <w:rPr/>
-        <w:t>Slide-equivalent 7 — Addressing Data Sovereignty and Governance</w:t>
-      </w:r>
-    </w:p>
-    <w:p>
-      <w:r>
-        <w:rPr>
-          <w:b/>
-        </w:rPr>
-        <w:t>Talking point:</w:t>
-      </w:r>
-      <w:r>
-        <w:rPr/>
-        <w:t xml:space="preserve"> "We built ClarityDocs for institutional governance, not automation—ensuring your sensitive student narratives remain within your secure, existing infrastructure, without ever bypassing human-led disciplinary review."</w:t>
+        <w:t xml:space="preserve"> Stop arguing about which handbook is current — run one conflict register on synthetic catalogue and handbook excerpts and leave with a DOCX brief, not a slide file.</w:t>
       </w:r>
     </w:p>
     <w:p>
@@ -510,19 +403,7 @@
       </w:r>
       <w:r>
         <w:rPr/>
-        <w:t xml:space="preserve"> The primary concern we hear from academic operations leaders is the risk of housing sensitive student records within an external 'black box.' We understand this hesitation, which is why ClarityDocs is architected as a decision-support tool rather than an autonomous generative system. We do not require you to migrate your student records into a new, external repository or a black-box drafting engine.</w:t>
-      </w:r>
-    </w:p>
-    <w:p>
-      <w:r>
-        <w:rPr/>
-        <w:t>Instead, we anchor our analysis exclusively in your institution's existing documentation. When reviewing a faculty handbook or student code of conduct, the system references only the source material you authorize. It does not exert judgment; it identifies potential policy misalignments—such as contradictions between a specific grievance procedure and the overarching academic catalog—and flags them for the Registrar or policy committee to resolve. Every proposed edit is provided alongside an explicit citation of the source text.</w:t>
-      </w:r>
-    </w:p>
-    <w:p>
-      <w:r>
-        <w:rPr/>
-        <w:t>We maintain strict data sovereignty. We do not train models on your institution's records, nor do we automate determinations regarding student rights. Our goal is to ensure the integrity and compliance of the language submitted to the academic senate, allowing your team to focus on student success and policy efficacy rather than administrative reconciliation.</w:t>
+        <w:t xml:space="preserve"> Four competing "authoritative" PDFs is an accreditation and FERPA-process risk. ClarityDocs puts the history of the policy next to the text. When a grievance committee asks why a timeline was enforced on a term effective date, the team points to the register. We are not asking you to move to a new archive. We are asking you to make the documents you already live in the source of truth they should be.</w:t>
       </w:r>
     </w:p>
     <w:sectPr>

</xml_diff>